<commit_message>
Update report files with revised publication date and metadata adjustments
</commit_message>
<xml_diff>
--- a/projects/engineering-reporting-system/output/report.docx
+++ b/projects/engineering-reporting-system/output/report.docx
@@ -31,7 +31,7 @@
         <w:pStyle w:val="Date"/>
       </w:pPr>
       <w:r>
-        <w:t xml:space="preserve">2026-06-30</w:t>
+        <w:t xml:space="preserve">2026-07-01</w:t>
       </w:r>
     </w:p>
     <w:sdt>
@@ -427,7 +427,7 @@
               <w:rPr>
                 <w:rStyle w:val="VerbatimChar"/>
               </w:rPr>
-              <w:t xml:space="preserve">2026-06-30</w:t>
+              <w:t xml:space="preserve">2026-07-01</w:t>
             </w:r>
           </w:p>
         </w:tc>
@@ -3680,8 +3680,9 @@
         <w:tblLook w:firstRow="1" w:lastRow="0" w:firstColumn="0" w:lastColumn="0" w:noHBand="0" w:noVBand="0" w:val="0020"/>
       </w:tblPr>
       <w:tblGrid>
-        <w:gridCol w:w="3960"/>
-        <w:gridCol w:w="3960"/>
+        <w:gridCol w:w="2640"/>
+        <w:gridCol w:w="2640"/>
+        <w:gridCol w:w="2640"/>
       </w:tblGrid>
       <w:tr>
         <w:trPr>
@@ -3693,6 +3694,14 @@
             <w:pPr>
               <w:pStyle w:val="Compact"/>
             </w:pPr>
+          </w:p>
+        </w:tc>
+        <w:tc>
+          <w:tcPr/>
+          <w:p>
+            <w:pPr>
+              <w:pStyle w:val="Compact"/>
+            </w:pPr>
             <w:r>
               <w:t xml:space="preserve">KPI</w:t>
             </w:r>
@@ -3703,7 +3712,6 @@
           <w:p>
             <w:pPr>
               <w:pStyle w:val="Compact"/>
-              <w:jc w:val="right"/>
             </w:pPr>
             <w:r>
               <w:t xml:space="preserve">Result</w:t>
@@ -3719,19 +3727,29 @@
               <w:pStyle w:val="Compact"/>
             </w:pPr>
             <w:r>
-              <w:t xml:space="preserve">Maximum Temperature</w:t>
-            </w:r>
-          </w:p>
-        </w:tc>
-        <w:tc>
-          <w:tcPr/>
-          <w:p>
-            <w:pPr>
-              <w:pStyle w:val="Compact"/>
-              <w:jc w:val="right"/>
-            </w:pPr>
-            <w:r>
-              <w:t xml:space="preserve">90°C</w:t>
+              <w:t xml:space="preserve">0</w:t>
+            </w:r>
+          </w:p>
+        </w:tc>
+        <w:tc>
+          <w:tcPr/>
+          <w:p>
+            <w:pPr>
+              <w:pStyle w:val="Compact"/>
+            </w:pPr>
+            <w:r>
+              <w:t xml:space="preserve">Samples</w:t>
+            </w:r>
+          </w:p>
+        </w:tc>
+        <w:tc>
+          <w:tcPr/>
+          <w:p>
+            <w:pPr>
+              <w:pStyle w:val="Compact"/>
+            </w:pPr>
+            <w:r>
+              <w:t xml:space="preserve">30.00</w:t>
             </w:r>
           </w:p>
         </w:tc>
@@ -3744,19 +3762,29 @@
               <w:pStyle w:val="Compact"/>
             </w:pPr>
             <w:r>
-              <w:t xml:space="preserve">Average Temperature</w:t>
-            </w:r>
-          </w:p>
-        </w:tc>
-        <w:tc>
-          <w:tcPr/>
-          <w:p>
-            <w:pPr>
-              <w:pStyle w:val="Compact"/>
-              <w:jc w:val="right"/>
-            </w:pPr>
-            <w:r>
-              <w:t xml:space="preserve">56°C</w:t>
+              <w:t xml:space="preserve">1</w:t>
+            </w:r>
+          </w:p>
+        </w:tc>
+        <w:tc>
+          <w:tcPr/>
+          <w:p>
+            <w:pPr>
+              <w:pStyle w:val="Compact"/>
+            </w:pPr>
+            <w:r>
+              <w:t xml:space="preserve">Maximum Temperature</w:t>
+            </w:r>
+          </w:p>
+        </w:tc>
+        <w:tc>
+          <w:tcPr/>
+          <w:p>
+            <w:pPr>
+              <w:pStyle w:val="Compact"/>
+            </w:pPr>
+            <w:r>
+              <w:t xml:space="preserve">95.10</w:t>
             </w:r>
           </w:p>
         </w:tc>
@@ -3769,19 +3797,29 @@
               <w:pStyle w:val="Compact"/>
             </w:pPr>
             <w:r>
-              <w:t xml:space="preserve">Maximum Pressure</w:t>
-            </w:r>
-          </w:p>
-        </w:tc>
-        <w:tc>
-          <w:tcPr/>
-          <w:p>
-            <w:pPr>
-              <w:pStyle w:val="Compact"/>
-              <w:jc w:val="right"/>
-            </w:pPr>
-            <w:r>
-              <w:t xml:space="preserve">104.2 kPa</w:t>
+              <w:t xml:space="preserve">2</w:t>
+            </w:r>
+          </w:p>
+        </w:tc>
+        <w:tc>
+          <w:tcPr/>
+          <w:p>
+            <w:pPr>
+              <w:pStyle w:val="Compact"/>
+            </w:pPr>
+            <w:r>
+              <w:t xml:space="preserve">Minimum Temperature</w:t>
+            </w:r>
+          </w:p>
+        </w:tc>
+        <w:tc>
+          <w:tcPr/>
+          <w:p>
+            <w:pPr>
+              <w:pStyle w:val="Compact"/>
+            </w:pPr>
+            <w:r>
+              <w:t xml:space="preserve">20.10</w:t>
             </w:r>
           </w:p>
         </w:tc>
@@ -3794,19 +3832,29 @@
               <w:pStyle w:val="Compact"/>
             </w:pPr>
             <w:r>
-              <w:t xml:space="preserve">Voltage Drift</w:t>
-            </w:r>
-          </w:p>
-        </w:tc>
-        <w:tc>
-          <w:tcPr/>
-          <w:p>
-            <w:pPr>
-              <w:pStyle w:val="Compact"/>
-              <w:jc w:val="right"/>
-            </w:pPr>
-            <w:r>
-              <w:t xml:space="preserve">0.06 V</w:t>
+              <w:t xml:space="preserve">3</w:t>
+            </w:r>
+          </w:p>
+        </w:tc>
+        <w:tc>
+          <w:tcPr/>
+          <w:p>
+            <w:pPr>
+              <w:pStyle w:val="Compact"/>
+            </w:pPr>
+            <w:r>
+              <w:t xml:space="preserve">Average Temperature</w:t>
+            </w:r>
+          </w:p>
+        </w:tc>
+        <w:tc>
+          <w:tcPr/>
+          <w:p>
+            <w:pPr>
+              <w:pStyle w:val="Compact"/>
+            </w:pPr>
+            <w:r>
+              <w:t xml:space="preserve">64.30</w:t>
             </w:r>
           </w:p>
         </w:tc>
@@ -3819,19 +3867,134 @@
               <w:pStyle w:val="Compact"/>
             </w:pPr>
             <w:r>
-              <w:t xml:space="preserve">Missing Samples</w:t>
-            </w:r>
-          </w:p>
-        </w:tc>
-        <w:tc>
-          <w:tcPr/>
-          <w:p>
-            <w:pPr>
-              <w:pStyle w:val="Compact"/>
-              <w:jc w:val="right"/>
-            </w:pPr>
-            <w:r>
-              <w:t xml:space="preserve">0</w:t>
+              <w:t xml:space="preserve">4</w:t>
+            </w:r>
+          </w:p>
+        </w:tc>
+        <w:tc>
+          <w:tcPr/>
+          <w:p>
+            <w:pPr>
+              <w:pStyle w:val="Compact"/>
+            </w:pPr>
+            <w:r>
+              <w:t xml:space="preserve">Maximum Pressure</w:t>
+            </w:r>
+          </w:p>
+        </w:tc>
+        <w:tc>
+          <w:tcPr/>
+          <w:p>
+            <w:pPr>
+              <w:pStyle w:val="Compact"/>
+            </w:pPr>
+            <w:r>
+              <w:t xml:space="preserve">108.00</w:t>
+            </w:r>
+          </w:p>
+        </w:tc>
+      </w:tr>
+      <w:tr>
+        <w:tc>
+          <w:tcPr/>
+          <w:p>
+            <w:pPr>
+              <w:pStyle w:val="Compact"/>
+            </w:pPr>
+            <w:r>
+              <w:t xml:space="preserve">5</w:t>
+            </w:r>
+          </w:p>
+        </w:tc>
+        <w:tc>
+          <w:tcPr/>
+          <w:p>
+            <w:pPr>
+              <w:pStyle w:val="Compact"/>
+            </w:pPr>
+            <w:r>
+              <w:t xml:space="preserve">Average Pressure</w:t>
+            </w:r>
+          </w:p>
+        </w:tc>
+        <w:tc>
+          <w:tcPr/>
+          <w:p>
+            <w:pPr>
+              <w:pStyle w:val="Compact"/>
+            </w:pPr>
+            <w:r>
+              <w:t xml:space="preserve">105.30</w:t>
+            </w:r>
+          </w:p>
+        </w:tc>
+      </w:tr>
+      <w:tr>
+        <w:tc>
+          <w:tcPr/>
+          <w:p>
+            <w:pPr>
+              <w:pStyle w:val="Compact"/>
+            </w:pPr>
+            <w:r>
+              <w:t xml:space="preserve">6</w:t>
+            </w:r>
+          </w:p>
+        </w:tc>
+        <w:tc>
+          <w:tcPr/>
+          <w:p>
+            <w:pPr>
+              <w:pStyle w:val="Compact"/>
+            </w:pPr>
+            <w:r>
+              <w:t xml:space="preserve">Voltage Drift</w:t>
+            </w:r>
+          </w:p>
+        </w:tc>
+        <w:tc>
+          <w:tcPr/>
+          <w:p>
+            <w:pPr>
+              <w:pStyle w:val="Compact"/>
+            </w:pPr>
+            <w:r>
+              <w:t xml:space="preserve">0.11</w:t>
+            </w:r>
+          </w:p>
+        </w:tc>
+      </w:tr>
+      <w:tr>
+        <w:tc>
+          <w:tcPr/>
+          <w:p>
+            <w:pPr>
+              <w:pStyle w:val="Compact"/>
+            </w:pPr>
+            <w:r>
+              <w:t xml:space="preserve">7</w:t>
+            </w:r>
+          </w:p>
+        </w:tc>
+        <w:tc>
+          <w:tcPr/>
+          <w:p>
+            <w:pPr>
+              <w:pStyle w:val="Compact"/>
+            </w:pPr>
+            <w:r>
+              <w:t xml:space="preserve">Missing Values</w:t>
+            </w:r>
+          </w:p>
+        </w:tc>
+        <w:tc>
+          <w:tcPr/>
+          <w:p>
+            <w:pPr>
+              <w:pStyle w:val="Compact"/>
+            </w:pPr>
+            <w:r>
+              <w:t xml:space="preserve">0.00</w:t>
             </w:r>
           </w:p>
         </w:tc>
@@ -5612,7 +5775,7 @@
         <w:rPr>
           <w:rStyle w:val="VerbatimChar"/>
         </w:rPr>
-        <w:t xml:space="preserve">├── report.qmd</w:t>
+        <w:t xml:space="preserve">├── _quarto.yml</w:t>
       </w:r>
       <w:r>
         <w:br/>
@@ -5621,7 +5784,16 @@
         <w:rPr>
           <w:rStyle w:val="VerbatimChar"/>
         </w:rPr>
-        <w:t xml:space="preserve">├── _quarto.yml</w:t>
+        <w:t xml:space="preserve">├── report.qmd</w:t>
+      </w:r>
+      <w:r>
+        <w:br/>
+      </w:r>
+      <w:r>
+        <w:rPr>
+          <w:rStyle w:val="VerbatimChar"/>
+        </w:rPr>
+        <w:t xml:space="preserve">├── requirements.txt</w:t>
       </w:r>
       <w:r>
         <w:br/>
@@ -5649,15 +5821,6 @@
           <w:rStyle w:val="VerbatimChar"/>
         </w:rPr>
         <w:t xml:space="preserve">├── templates/</w:t>
-      </w:r>
-      <w:r>
-        <w:br/>
-      </w:r>
-      <w:r>
-        <w:rPr>
-          <w:rStyle w:val="VerbatimChar"/>
-        </w:rPr>
-        <w:t xml:space="preserve">├── images/</w:t>
       </w:r>
       <w:r>
         <w:br/>

</xml_diff>